<commit_message>
Finalize project report and documentation
</commit_message>
<xml_diff>
--- a/05_Project_Report/Bachamgari_Hemanth_Goud_ProjectReport.docx
+++ b/05_Project_Report/Bachamgari_Hemanth_Goud_ProjectReport.docx
@@ -256,6 +256,7 @@
         <w:pStyle w:val="Heading1"/>
       </w:pPr>
       <w:r>
+        <w:lastRenderedPageBreak/>
         <w:t>1. Executive Summary</w:t>
       </w:r>
     </w:p>
@@ -702,6 +703,7 @@
         <w:pStyle w:val="ListBullet"/>
       </w:pPr>
       <w:r>
+        <w:lastRenderedPageBreak/>
         <w:t>Kept positive Quantity and UnitPrice values for sales analysis.</w:t>
       </w:r>
     </w:p>
@@ -1044,6 +1046,7 @@
         <w:pStyle w:val="Heading1"/>
       </w:pPr>
       <w:r>
+        <w:lastRenderedPageBreak/>
         <w:t>7. Customer Segmentation Results</w:t>
       </w:r>
     </w:p>
@@ -1577,6 +1580,7 @@
         <w:rPr>
           <w:b/>
         </w:rPr>
+        <w:lastRenderedPageBreak/>
         <w:t xml:space="preserve">Inactive Customer Analysis: </w:t>
       </w:r>
       <w:r>
@@ -1619,6 +1623,38 @@
       </w:r>
     </w:p>
     <w:p>
+      <w:r>
+        <w:rPr>
+          <w:b/>
+          <w:bCs/>
+        </w:rPr>
+        <w:t>Live Dashboard:</w:t>
+      </w:r>
+      <w:r>
+        <w:t xml:space="preserve"> </w:t>
+      </w:r>
+      <w:hyperlink r:id="rId8" w:tgtFrame="_new" w:history="1">
+        <w:r>
+          <w:rPr>
+            <w:rStyle w:val="Hyperlink"/>
+          </w:rPr>
+          <w:t>Open</w:t>
+        </w:r>
+        <w:r>
+          <w:rPr>
+            <w:rStyle w:val="Hyperlink"/>
+          </w:rPr>
+          <w:t xml:space="preserve"> </w:t>
+        </w:r>
+        <w:r>
+          <w:rPr>
+            <w:rStyle w:val="Hyperlink"/>
+          </w:rPr>
+          <w:t>Live Dashboard</w:t>
+        </w:r>
+      </w:hyperlink>
+    </w:p>
+    <w:p>
       <w:pPr>
         <w:pStyle w:val="ListBullet"/>
       </w:pPr>
@@ -1706,7 +1742,7 @@
                     </pic:cNvPicPr>
                   </pic:nvPicPr>
                   <pic:blipFill>
-                    <a:blip r:embed="rId8">
+                    <a:blip r:embed="rId9">
                       <a:extLst>
                         <a:ext uri="{28A0092B-C50C-407E-A947-70E740481C1C}">
                           <a14:useLocalDpi xmlns:a14="http://schemas.microsoft.com/office/drawing/2010/main" val="0"/>
@@ -1757,6 +1793,7 @@
         <w:rPr>
           <w:noProof/>
         </w:rPr>
+        <w:lastRenderedPageBreak/>
         <w:drawing>
           <wp:inline distT="0" distB="0" distL="0" distR="0" wp14:anchorId="6A59921D" wp14:editId="460C4FA3">
             <wp:extent cx="6400800" cy="3602182"/>
@@ -1781,7 +1818,7 @@
                     </pic:cNvPicPr>
                   </pic:nvPicPr>
                   <pic:blipFill>
-                    <a:blip r:embed="rId9">
+                    <a:blip r:embed="rId10">
                       <a:extLst>
                         <a:ext uri="{28A0092B-C50C-407E-A947-70E740481C1C}">
                           <a14:useLocalDpi xmlns:a14="http://schemas.microsoft.com/office/drawing/2010/main" val="0"/>
@@ -1848,7 +1885,7 @@
                     </pic:cNvPicPr>
                   </pic:nvPicPr>
                   <pic:blipFill>
-                    <a:blip r:embed="rId10">
+                    <a:blip r:embed="rId11">
                       <a:extLst>
                         <a:ext uri="{28A0092B-C50C-407E-A947-70E740481C1C}">
                           <a14:useLocalDpi xmlns:a14="http://schemas.microsoft.com/office/drawing/2010/main" val="0"/>
@@ -1905,6 +1942,7 @@
         <w:rPr>
           <w:noProof/>
         </w:rPr>
+        <w:lastRenderedPageBreak/>
         <w:drawing>
           <wp:inline distT="0" distB="0" distL="0" distR="0" wp14:anchorId="218EB7D6" wp14:editId="05475004">
             <wp:extent cx="6400268" cy="3776133"/>
@@ -1929,7 +1967,7 @@
                     </pic:cNvPicPr>
                   </pic:nvPicPr>
                   <pic:blipFill>
-                    <a:blip r:embed="rId11">
+                    <a:blip r:embed="rId12">
                       <a:extLst>
                         <a:ext uri="{28A0092B-C50C-407E-A947-70E740481C1C}">
                           <a14:useLocalDpi xmlns:a14="http://schemas.microsoft.com/office/drawing/2010/main" val="0"/>
@@ -2001,7 +2039,7 @@
                     </pic:cNvPicPr>
                   </pic:nvPicPr>
                   <pic:blipFill>
-                    <a:blip r:embed="rId12">
+                    <a:blip r:embed="rId13">
                       <a:extLst>
                         <a:ext uri="{28A0092B-C50C-407E-A947-70E740481C1C}">
                           <a14:useLocalDpi xmlns:a14="http://schemas.microsoft.com/office/drawing/2010/main" val="0"/>
@@ -2058,6 +2096,7 @@
         <w:rPr>
           <w:noProof/>
         </w:rPr>
+        <w:lastRenderedPageBreak/>
         <w:drawing>
           <wp:inline distT="0" distB="0" distL="0" distR="0" wp14:anchorId="16BF23B9" wp14:editId="72A49CF7">
             <wp:extent cx="6400290" cy="3774831"/>
@@ -2082,7 +2121,7 @@
                     </pic:cNvPicPr>
                   </pic:nvPicPr>
                   <pic:blipFill>
-                    <a:blip r:embed="rId13">
+                    <a:blip r:embed="rId14">
                       <a:extLst>
                         <a:ext uri="{28A0092B-C50C-407E-A947-70E740481C1C}">
                           <a14:useLocalDpi xmlns:a14="http://schemas.microsoft.com/office/drawing/2010/main" val="0"/>
@@ -2154,7 +2193,7 @@
                     </pic:cNvPicPr>
                   </pic:nvPicPr>
                   <pic:blipFill>
-                    <a:blip r:embed="rId14">
+                    <a:blip r:embed="rId15">
                       <a:extLst>
                         <a:ext uri="{28A0092B-C50C-407E-A947-70E740481C1C}">
                           <a14:useLocalDpi xmlns:a14="http://schemas.microsoft.com/office/drawing/2010/main" val="0"/>
@@ -2364,7 +2403,7 @@
       </w:r>
     </w:p>
     <w:sectPr>
-      <w:footerReference w:type="default" r:id="rId15"/>
+      <w:footerReference w:type="default" r:id="rId16"/>
       <w:pgSz w:w="12240" w:h="15840"/>
       <w:pgMar w:top="936" w:right="1080" w:bottom="936" w:left="1080" w:header="720" w:footer="720" w:gutter="0"/>
       <w:cols w:space="720"/>
@@ -3248,7 +3287,6 @@
   <w:style w:type="character" w:default="1" w:styleId="DefaultParagraphFont">
     <w:name w:val="Default Paragraph Font"/>
     <w:uiPriority w:val="1"/>
-    <w:semiHidden/>
     <w:unhideWhenUsed/>
   </w:style>
   <w:style w:type="table" w:default="1" w:styleId="TableNormal">
@@ -14024,6 +14062,41 @@
         <w:shd w:val="clear" w:color="auto" w:fill="FBCAA2" w:themeFill="accent6" w:themeFillTint="7F"/>
       </w:tcPr>
     </w:tblStylePr>
+  </w:style>
+  <w:style w:type="character" w:styleId="Hyperlink">
+    <w:name w:val="Hyperlink"/>
+    <w:basedOn w:val="DefaultParagraphFont"/>
+    <w:uiPriority w:val="99"/>
+    <w:unhideWhenUsed/>
+    <w:rsid w:val="00523E40"/>
+    <w:rPr>
+      <w:color w:val="0000FF" w:themeColor="hyperlink"/>
+      <w:u w:val="single"/>
+    </w:rPr>
+  </w:style>
+  <w:style w:type="character" w:styleId="UnresolvedMention">
+    <w:name w:val="Unresolved Mention"/>
+    <w:basedOn w:val="DefaultParagraphFont"/>
+    <w:uiPriority w:val="99"/>
+    <w:semiHidden/>
+    <w:unhideWhenUsed/>
+    <w:rsid w:val="00523E40"/>
+    <w:rPr>
+      <w:color w:val="605E5C"/>
+      <w:shd w:val="clear" w:color="auto" w:fill="E1DFDD"/>
+    </w:rPr>
+  </w:style>
+  <w:style w:type="character" w:styleId="FollowedHyperlink">
+    <w:name w:val="FollowedHyperlink"/>
+    <w:basedOn w:val="DefaultParagraphFont"/>
+    <w:uiPriority w:val="99"/>
+    <w:semiHidden/>
+    <w:unhideWhenUsed/>
+    <w:rsid w:val="00523E40"/>
+    <w:rPr>
+      <w:color w:val="800080" w:themeColor="followedHyperlink"/>
+      <w:u w:val="single"/>
+    </w:rPr>
   </w:style>
 </w:styles>
 </file>
@@ -14356,7 +14429,6 @@
 <ds:datastoreItem xmlns:ds="http://schemas.openxmlformats.org/officeDocument/2006/customXml" ds:itemID="{EF278816-EC6F-A645-907D-7F25AECB1D4A}">
   <ds:schemaRefs>
     <ds:schemaRef ds:uri="http://schemas.openxmlformats.org/officeDocument/2006/bibliography"/>
-    <ds:schemaRef ds:uri="http://www.w3.org/2000/xmlns/"/>
   </ds:schemaRefs>
 </ds:datastoreItem>
 </file>
</xml_diff>